<commit_message>
DAXSA: reiteración sin advertencia de queja
Co-Authored-By: Claude Opus 5.5 <noreply@anthropic.com>
Claude-Session: https://claude.ai/code/session_01Ls5dNjYBLNjXxuGTDk7v3H
</commit_message>
<xml_diff>
--- a/carta-reclamo/daxsa/Carta_DAXSA_Reiteracion.docx
+++ b/carta-reclamo/daxsa/Carta_DAXSA_Reiteracion.docx
@@ -624,7 +624,7 @@
         <w:t xml:space="preserve"> </w:t>
       </w:r>
       <w:r>
-        <w:t xml:space="preserve">(artículo 2, inciso 20 de la Constitución Política del Perú) y del</w:t>
+        <w:t xml:space="preserve">(artículo 2, inciso 20 de la Constitución Política del Perú) y conforme al</w:t>
       </w:r>
       <w:r>
         <w:t xml:space="preserve"> </w:t>
@@ -637,55 +637,7 @@
         <w:t xml:space="preserve">TUO de la Ley N.° 27444</w:t>
       </w:r>
       <w:r>
-        <w:t xml:space="preserve">, cuyo</w:t>
-      </w:r>
-      <w:r>
-        <w:t xml:space="preserve"> </w:t>
-      </w:r>
-      <w:r>
-        <w:rPr>
-          <w:bCs/>
-          <w:b/>
-        </w:rPr>
-        <w:t xml:space="preserve">artículo 142</w:t>
-      </w:r>
-      <w:r>
-        <w:t xml:space="preserve"> </w:t>
-      </w:r>
-      <w:r>
-        <w:t xml:space="preserve">establece que los plazos obligan por igual a la Administración. De no recibir respuesta, presentaremos</w:t>
-      </w:r>
-      <w:r>
-        <w:t xml:space="preserve"> </w:t>
-      </w:r>
-      <w:r>
-        <w:rPr>
-          <w:bCs/>
-          <w:b/>
-        </w:rPr>
-        <w:t xml:space="preserve">queja por defecto de tramitación</w:t>
-      </w:r>
-      <w:r>
-        <w:t xml:space="preserve"> </w:t>
-      </w:r>
-      <w:r>
-        <w:t xml:space="preserve">ante la Jefatura de PERÚ COMPRAS, conforme al</w:t>
-      </w:r>
-      <w:r>
-        <w:t xml:space="preserve"> </w:t>
-      </w:r>
-      <w:r>
-        <w:rPr>
-          <w:bCs/>
-          <w:b/>
-        </w:rPr>
-        <w:t xml:space="preserve">artículo 169</w:t>
-      </w:r>
-      <w:r>
-        <w:t xml:space="preserve"> </w:t>
-      </w:r>
-      <w:r>
-        <w:t xml:space="preserve">de la misma norma.</w:t>
+        <w:t xml:space="preserve">, Ley del Procedimiento Administrativo General. Agradecemos de antemano su pronta atención.</w:t>
       </w:r>
     </w:p>
     <w:p>

</xml_diff>